<commit_message>
weekly log week 5
</commit_message>
<xml_diff>
--- a/FYP_2026_2027/WEEKLY_LOGS/Weekly_Meeting_Log_2026_2027.docx
+++ b/FYP_2026_2027/WEEKLY_LOGS/Weekly_Meeting_Log_2026_2027.docx
@@ -92,8 +92,17 @@
                 <w:color w:val="000000" w:themeColor="text1"/>
                 <w:lang w:val="en-GB"/>
               </w:rPr>
-              <w:t>12</w:t>
-            </w:r>
+              <w:t>1</w:t>
+            </w:r>
+            <w:r>
+              <w:rPr>
+                <w:rFonts w:ascii="Arial" w:eastAsia="Arial" w:hAnsi="Arial" w:cs="Arial"/>
+                <w:color w:val="000000" w:themeColor="text1"/>
+                <w:lang w:val="en-GB"/>
+              </w:rPr>
+              <w:t>9</w:t>
+            </w:r>
+            <w:proofErr w:type="gramStart"/>
             <w:r>
               <w:rPr>
                 <w:rFonts w:ascii="Arial" w:eastAsia="Arial" w:hAnsi="Arial" w:cs="Arial"/>
@@ -125,15 +134,16 @@
                 <w:color w:val="000000" w:themeColor="text1"/>
                 <w:lang w:val="en-GB"/>
               </w:rPr>
-              <w:t xml:space="preserve">To October </w:t>
-            </w:r>
+              <w:t>To</w:t>
+            </w:r>
+            <w:proofErr w:type="gramEnd"/>
             <w:r>
               <w:rPr>
                 <w:rFonts w:ascii="Arial" w:eastAsia="Arial" w:hAnsi="Arial" w:cs="Arial"/>
                 <w:color w:val="000000" w:themeColor="text1"/>
                 <w:lang w:val="en-GB"/>
               </w:rPr>
-              <w:t>1</w:t>
+              <w:t xml:space="preserve"> October</w:t>
             </w:r>
             <w:r>
               <w:rPr>
@@ -141,7 +151,7 @@
                 <w:color w:val="000000" w:themeColor="text1"/>
                 <w:lang w:val="en-GB"/>
               </w:rPr>
-              <w:t>8</w:t>
+              <w:t xml:space="preserve"> 25</w:t>
             </w:r>
             <w:r>
               <w:rPr>
@@ -268,7 +278,25 @@
                 <w:bCs/>
                 <w:color w:val="000000" w:themeColor="text1"/>
               </w:rPr>
-              <w:t>4:10</w:t>
+              <w:t>3</w:t>
+            </w:r>
+            <w:r>
+              <w:rPr>
+                <w:rFonts w:ascii="Arial" w:eastAsia="Arial" w:hAnsi="Arial" w:cs="Arial"/>
+                <w:b/>
+                <w:bCs/>
+                <w:color w:val="000000" w:themeColor="text1"/>
+              </w:rPr>
+              <w:t>:1</w:t>
+            </w:r>
+            <w:r>
+              <w:rPr>
+                <w:rFonts w:ascii="Arial" w:eastAsia="Arial" w:hAnsi="Arial" w:cs="Arial"/>
+                <w:b/>
+                <w:bCs/>
+                <w:color w:val="000000" w:themeColor="text1"/>
+              </w:rPr>
+              <w:t>5</w:t>
             </w:r>
           </w:p>
         </w:tc>
@@ -345,7 +373,7 @@
                 <w:bCs/>
                 <w:color w:val="000000" w:themeColor="text1"/>
               </w:rPr>
-              <w:t>14:17</w:t>
+              <w:t>13:29</w:t>
             </w:r>
           </w:p>
         </w:tc>
@@ -494,6 +522,7 @@
                 <w:szCs w:val="22"/>
               </w:rPr>
             </w:pPr>
+            <w:proofErr w:type="gramStart"/>
             <w:r>
               <w:rPr>
                 <w:rFonts w:ascii="Arial" w:eastAsia="Arial" w:hAnsi="Arial" w:cs="Arial"/>
@@ -502,7 +531,18 @@
                 <w:szCs w:val="22"/>
                 <w:lang w:val="en-GB"/>
               </w:rPr>
-              <w:t>Notes : Also record project backlog, use notes page as required</w:t>
+              <w:t>Notes :</w:t>
+            </w:r>
+            <w:proofErr w:type="gramEnd"/>
+            <w:r>
+              <w:rPr>
+                <w:rFonts w:ascii="Arial" w:eastAsia="Arial" w:hAnsi="Arial" w:cs="Arial"/>
+                <w:color w:val="000000" w:themeColor="text1"/>
+                <w:sz w:val="22"/>
+                <w:szCs w:val="22"/>
+                <w:lang w:val="en-GB"/>
+              </w:rPr>
+              <w:t xml:space="preserve"> Also record project backlog, use notes page as required</w:t>
             </w:r>
             <w:r>
               <w:tab/>
@@ -534,58 +574,132 @@
                 <w:rFonts w:ascii="Arial" w:eastAsia="Arial" w:hAnsi="Arial" w:cs="Arial"/>
                 <w:color w:val="000000" w:themeColor="text1"/>
               </w:rPr>
-              <w:t xml:space="preserve">This week, there is not a lot to report, I spoke with Muhammed on both Monday and Thursday albeit very briefly. We discussed </w:t>
-            </w:r>
-            <w:r>
-              <w:rPr>
-                <w:rFonts w:ascii="Arial" w:eastAsia="Arial" w:hAnsi="Arial" w:cs="Arial"/>
-                <w:color w:val="000000" w:themeColor="text1"/>
-              </w:rPr>
-              <w:t xml:space="preserve">what’s next, </w:t>
-            </w:r>
-            <w:r>
-              <w:rPr>
-                <w:rFonts w:ascii="Arial" w:eastAsia="Arial" w:hAnsi="Arial" w:cs="Arial"/>
-                <w:color w:val="000000" w:themeColor="text1"/>
-              </w:rPr>
-              <w:t>I am going to continue to update my demo and add additional features</w:t>
-            </w:r>
-            <w:r>
-              <w:rPr>
-                <w:rFonts w:ascii="Arial" w:eastAsia="Arial" w:hAnsi="Arial" w:cs="Arial"/>
-                <w:color w:val="000000" w:themeColor="text1"/>
-              </w:rPr>
-              <w:t>. I completed all documentation which was needed and also updated my Github folders</w:t>
-            </w:r>
-            <w:r>
-              <w:rPr>
-                <w:rFonts w:ascii="Arial" w:eastAsia="Arial" w:hAnsi="Arial" w:cs="Arial"/>
-                <w:color w:val="000000" w:themeColor="text1"/>
-              </w:rPr>
-              <w:t>. I didn’t get as much done as I had planned due to work and having to attend a funeral.</w:t>
-            </w:r>
-          </w:p>
-          <w:p>
-            <w:pPr>
-              <w:rPr>
-                <w:rFonts w:ascii="Arial" w:eastAsia="Arial" w:hAnsi="Arial" w:cs="Arial"/>
-                <w:color w:val="000000" w:themeColor="text1"/>
-              </w:rPr>
-            </w:pPr>
-          </w:p>
-          <w:p>
-            <w:pPr>
-              <w:rPr>
-                <w:rFonts w:ascii="Arial" w:eastAsia="Arial" w:hAnsi="Arial" w:cs="Arial"/>
-                <w:color w:val="000000" w:themeColor="text1"/>
-              </w:rPr>
-            </w:pPr>
-            <w:r>
-              <w:rPr>
-                <w:rFonts w:ascii="Arial" w:eastAsia="Arial" w:hAnsi="Arial" w:cs="Arial"/>
-                <w:color w:val="000000" w:themeColor="text1"/>
-              </w:rPr>
-              <w:t>Progress is still being made and I will continue working hard on the project</w:t>
+              <w:t>This week</w:t>
+            </w:r>
+            <w:r>
+              <w:rPr>
+                <w:rFonts w:ascii="Arial" w:eastAsia="Arial" w:hAnsi="Arial" w:cs="Arial"/>
+                <w:color w:val="000000" w:themeColor="text1"/>
+              </w:rPr>
+              <w:t xml:space="preserve"> Muhammed and I met on Wednesday. I showed him my progress</w:t>
+            </w:r>
+            <w:r>
+              <w:rPr>
+                <w:rFonts w:ascii="Arial" w:eastAsia="Arial" w:hAnsi="Arial" w:cs="Arial"/>
+                <w:color w:val="000000" w:themeColor="text1"/>
+              </w:rPr>
+              <w:t xml:space="preserve">. We discussed what was next and </w:t>
+            </w:r>
+            <w:proofErr w:type="gramStart"/>
+            <w:r>
+              <w:rPr>
+                <w:rFonts w:ascii="Arial" w:eastAsia="Arial" w:hAnsi="Arial" w:cs="Arial"/>
+                <w:color w:val="000000" w:themeColor="text1"/>
+              </w:rPr>
+              <w:t>on</w:t>
+            </w:r>
+            <w:proofErr w:type="gramEnd"/>
+            <w:r>
+              <w:rPr>
+                <w:rFonts w:ascii="Arial" w:eastAsia="Arial" w:hAnsi="Arial" w:cs="Arial"/>
+                <w:color w:val="000000" w:themeColor="text1"/>
+              </w:rPr>
+              <w:t xml:space="preserve"> my Gantt Chart. I plan to spend a month trying to get a whole level 01 done, this would include some placeholder models but also </w:t>
+            </w:r>
+            <w:r>
+              <w:rPr>
+                <w:rFonts w:ascii="Arial" w:eastAsia="Arial" w:hAnsi="Arial" w:cs="Arial"/>
+                <w:color w:val="000000" w:themeColor="text1"/>
+              </w:rPr>
+              <w:t>have finished models to give a strong visual identity.</w:t>
+            </w:r>
+          </w:p>
+          <w:p>
+            <w:pPr>
+              <w:rPr>
+                <w:rFonts w:ascii="Arial" w:eastAsia="Arial" w:hAnsi="Arial" w:cs="Arial"/>
+                <w:color w:val="000000" w:themeColor="text1"/>
+              </w:rPr>
+            </w:pPr>
+          </w:p>
+          <w:p>
+            <w:pPr>
+              <w:rPr>
+                <w:rFonts w:ascii="Arial" w:eastAsia="Arial" w:hAnsi="Arial" w:cs="Arial"/>
+                <w:color w:val="000000" w:themeColor="text1"/>
+              </w:rPr>
+            </w:pPr>
+            <w:r>
+              <w:rPr>
+                <w:rFonts w:ascii="Arial" w:eastAsia="Arial" w:hAnsi="Arial" w:cs="Arial"/>
+                <w:color w:val="000000" w:themeColor="text1"/>
+              </w:rPr>
+              <w:t>The game is running well but has some slight bugs and issues, which is to be expected.</w:t>
+            </w:r>
+            <w:r>
+              <w:rPr>
+                <w:rFonts w:ascii="Arial" w:eastAsia="Arial" w:hAnsi="Arial" w:cs="Arial"/>
+                <w:color w:val="000000" w:themeColor="text1"/>
+              </w:rPr>
+              <w:t xml:space="preserve"> After the meeting, there was a bit of an overhaul</w:t>
+            </w:r>
+            <w:r>
+              <w:rPr>
+                <w:rFonts w:ascii="Arial" w:eastAsia="Arial" w:hAnsi="Arial" w:cs="Arial"/>
+                <w:color w:val="000000" w:themeColor="text1"/>
+              </w:rPr>
+              <w:t xml:space="preserve">, the test scene has </w:t>
+            </w:r>
+            <w:r>
+              <w:rPr>
+                <w:rFonts w:ascii="Arial" w:eastAsia="Arial" w:hAnsi="Arial" w:cs="Arial"/>
+                <w:color w:val="000000" w:themeColor="text1"/>
+              </w:rPr>
+              <w:t xml:space="preserve">been </w:t>
+            </w:r>
+            <w:r>
+              <w:rPr>
+                <w:rFonts w:ascii="Arial" w:eastAsia="Arial" w:hAnsi="Arial" w:cs="Arial"/>
+                <w:color w:val="000000" w:themeColor="text1"/>
+              </w:rPr>
+              <w:t xml:space="preserve">changed to be </w:t>
+            </w:r>
+            <w:proofErr w:type="gramStart"/>
+            <w:r>
+              <w:rPr>
+                <w:rFonts w:ascii="Arial" w:eastAsia="Arial" w:hAnsi="Arial" w:cs="Arial"/>
+                <w:color w:val="000000" w:themeColor="text1"/>
+              </w:rPr>
+              <w:t>more close</w:t>
+            </w:r>
+            <w:proofErr w:type="gramEnd"/>
+            <w:r>
+              <w:rPr>
+                <w:rFonts w:ascii="Arial" w:eastAsia="Arial" w:hAnsi="Arial" w:cs="Arial"/>
+                <w:color w:val="000000" w:themeColor="text1"/>
+              </w:rPr>
+              <w:t xml:space="preserve"> to the final level, so I added a r</w:t>
+            </w:r>
+            <w:r>
+              <w:rPr>
+                <w:rFonts w:ascii="Arial" w:eastAsia="Arial" w:hAnsi="Arial" w:cs="Arial"/>
+                <w:color w:val="000000" w:themeColor="text1"/>
+              </w:rPr>
+              <w:t>oad, blown out building, an apocalyptic looking sky</w:t>
+            </w:r>
+            <w:r>
+              <w:rPr>
+                <w:rFonts w:ascii="Arial" w:eastAsia="Arial" w:hAnsi="Arial" w:cs="Arial"/>
+                <w:color w:val="000000" w:themeColor="text1"/>
+              </w:rPr>
+              <w:t xml:space="preserve"> and other test models. I want to really </w:t>
+            </w:r>
+            <w:r>
+              <w:rPr>
+                <w:rFonts w:ascii="Arial" w:eastAsia="Arial" w:hAnsi="Arial" w:cs="Arial"/>
+                <w:color w:val="000000" w:themeColor="text1"/>
+              </w:rPr>
+              <w:t>add also the ability to pick up items, which is my next focus.</w:t>
             </w:r>
           </w:p>
         </w:tc>
@@ -728,7 +842,14 @@
                 <w:rFonts w:ascii="Arial" w:eastAsia="Arial" w:hAnsi="Arial" w:cs="Arial"/>
                 <w:color w:val="000000" w:themeColor="text1"/>
               </w:rPr>
-              <w:t>Keep working on the demo, add features such as combat and other fix any minor issues</w:t>
+              <w:t>Add an equitable item</w:t>
+            </w:r>
+            <w:r>
+              <w:rPr>
+                <w:rFonts w:ascii="Arial" w:eastAsia="Arial" w:hAnsi="Arial" w:cs="Arial"/>
+                <w:color w:val="000000" w:themeColor="text1"/>
+              </w:rPr>
+              <w:t>.</w:t>
             </w:r>
           </w:p>
         </w:tc>
@@ -784,7 +905,14 @@
                 <w:rFonts w:ascii="Arial" w:eastAsia="Arial" w:hAnsi="Arial" w:cs="Arial"/>
                 <w:color w:val="000000" w:themeColor="text1"/>
               </w:rPr>
-              <w:t>Update charts as needed</w:t>
+              <w:t>Change perspective and add a test model</w:t>
+            </w:r>
+            <w:r>
+              <w:rPr>
+                <w:rFonts w:ascii="Arial" w:eastAsia="Arial" w:hAnsi="Arial" w:cs="Arial"/>
+                <w:color w:val="000000" w:themeColor="text1"/>
+              </w:rPr>
+              <w:t>.</w:t>
             </w:r>
           </w:p>
           <w:p>
@@ -843,6 +971,20 @@
                 <w:color w:val="000000" w:themeColor="text1"/>
               </w:rPr>
             </w:pPr>
+            <w:r>
+              <w:rPr>
+                <w:rFonts w:ascii="Arial" w:eastAsia="Arial" w:hAnsi="Arial" w:cs="Arial"/>
+                <w:color w:val="000000" w:themeColor="text1"/>
+              </w:rPr>
+              <w:t>Keep building up the new scene</w:t>
+            </w:r>
+            <w:r>
+              <w:rPr>
+                <w:rFonts w:ascii="Arial" w:eastAsia="Arial" w:hAnsi="Arial" w:cs="Arial"/>
+                <w:color w:val="000000" w:themeColor="text1"/>
+              </w:rPr>
+              <w:t>.</w:t>
+            </w:r>
           </w:p>
         </w:tc>
       </w:tr>
@@ -892,6 +1034,20 @@
                 <w:color w:val="000000" w:themeColor="text1"/>
               </w:rPr>
             </w:pPr>
+            <w:r>
+              <w:rPr>
+                <w:rFonts w:ascii="Arial" w:eastAsia="Arial" w:hAnsi="Arial" w:cs="Arial"/>
+                <w:color w:val="000000" w:themeColor="text1"/>
+              </w:rPr>
+              <w:t>Create more FBX models</w:t>
+            </w:r>
+            <w:r>
+              <w:rPr>
+                <w:rFonts w:ascii="Arial" w:eastAsia="Arial" w:hAnsi="Arial" w:cs="Arial"/>
+                <w:color w:val="000000" w:themeColor="text1"/>
+              </w:rPr>
+              <w:t>.</w:t>
+            </w:r>
           </w:p>
         </w:tc>
       </w:tr>
@@ -941,6 +1097,20 @@
                 <w:color w:val="000000" w:themeColor="text1"/>
               </w:rPr>
             </w:pPr>
+            <w:r>
+              <w:rPr>
+                <w:rFonts w:ascii="Arial" w:eastAsia="Arial" w:hAnsi="Arial" w:cs="Arial"/>
+                <w:color w:val="000000" w:themeColor="text1"/>
+              </w:rPr>
+              <w:t>Polish and fix bugs and issues</w:t>
+            </w:r>
+            <w:r>
+              <w:rPr>
+                <w:rFonts w:ascii="Arial" w:eastAsia="Arial" w:hAnsi="Arial" w:cs="Arial"/>
+                <w:color w:val="000000" w:themeColor="text1"/>
+              </w:rPr>
+              <w:t>.</w:t>
+            </w:r>
           </w:p>
           <w:p>
             <w:pPr>
@@ -1086,6 +1256,72 @@
                 <w:color w:val="000000" w:themeColor="text1"/>
               </w:rPr>
             </w:pPr>
+            <w:r>
+              <w:rPr>
+                <w:rFonts w:ascii="Arial" w:eastAsia="Arial" w:hAnsi="Arial" w:cs="Arial"/>
+                <w:color w:val="000000" w:themeColor="text1"/>
+              </w:rPr>
+              <w:t>Muhammed would like me to keep working as I am. Some notes included making my weekly logs more detailed</w:t>
+            </w:r>
+            <w:r>
+              <w:rPr>
+                <w:rFonts w:ascii="Arial" w:eastAsia="Arial" w:hAnsi="Arial" w:cs="Arial"/>
+                <w:color w:val="000000" w:themeColor="text1"/>
+              </w:rPr>
+              <w:t>.</w:t>
+            </w:r>
+          </w:p>
+          <w:p>
+            <w:pPr>
+              <w:rPr>
+                <w:rFonts w:ascii="Arial" w:eastAsia="Arial" w:hAnsi="Arial" w:cs="Arial"/>
+                <w:color w:val="000000" w:themeColor="text1"/>
+              </w:rPr>
+            </w:pPr>
+          </w:p>
+          <w:p>
+            <w:pPr>
+              <w:rPr>
+                <w:rFonts w:ascii="Arial" w:eastAsia="Arial" w:hAnsi="Arial" w:cs="Arial"/>
+                <w:color w:val="000000" w:themeColor="text1"/>
+              </w:rPr>
+            </w:pPr>
+            <w:r>
+              <w:rPr>
+                <w:rFonts w:ascii="Arial" w:eastAsia="Arial" w:hAnsi="Arial" w:cs="Arial"/>
+                <w:color w:val="000000" w:themeColor="text1"/>
+              </w:rPr>
+              <w:t xml:space="preserve">Muhammed also wanted a test model </w:t>
+            </w:r>
+            <w:r>
+              <w:rPr>
+                <w:rFonts w:ascii="Arial" w:eastAsia="Arial" w:hAnsi="Arial" w:cs="Arial"/>
+                <w:color w:val="000000" w:themeColor="text1"/>
+              </w:rPr>
+              <w:t>to show the game from a 3</w:t>
+            </w:r>
+            <w:r>
+              <w:rPr>
+                <w:rFonts w:ascii="Arial" w:eastAsia="Arial" w:hAnsi="Arial" w:cs="Arial"/>
+                <w:color w:val="000000" w:themeColor="text1"/>
+                <w:vertAlign w:val="superscript"/>
+              </w:rPr>
+              <w:t>rd</w:t>
+            </w:r>
+            <w:r>
+              <w:rPr>
+                <w:rFonts w:ascii="Arial" w:eastAsia="Arial" w:hAnsi="Arial" w:cs="Arial"/>
+                <w:color w:val="000000" w:themeColor="text1"/>
+              </w:rPr>
+              <w:t xml:space="preserve"> person perspective</w:t>
+            </w:r>
+            <w:r>
+              <w:rPr>
+                <w:rFonts w:ascii="Arial" w:eastAsia="Arial" w:hAnsi="Arial" w:cs="Arial"/>
+                <w:color w:val="000000" w:themeColor="text1"/>
+              </w:rPr>
+              <w:t>.</w:t>
+            </w:r>
           </w:p>
           <w:p>
             <w:pPr>
@@ -1242,6 +1478,7 @@
                 <w:color w:val="000000" w:themeColor="text1"/>
                 <w:lang w:val="en-GB"/>
               </w:rPr>
+              <w:lastRenderedPageBreak/>
               <w:t>Signature</w:t>
             </w:r>
           </w:p>
@@ -1340,14 +1577,7 @@
                 <w:rFonts w:ascii="Arial" w:eastAsia="Arial" w:hAnsi="Arial" w:cs="Arial"/>
                 <w:color w:val="000000" w:themeColor="text1"/>
               </w:rPr>
-              <w:t>1</w:t>
-            </w:r>
-            <w:r>
-              <w:rPr>
-                <w:rFonts w:ascii="Arial" w:eastAsia="Arial" w:hAnsi="Arial" w:cs="Arial"/>
-                <w:color w:val="000000" w:themeColor="text1"/>
-              </w:rPr>
-              <w:t>8</w:t>
+              <w:t>25</w:t>
             </w:r>
             <w:r>
               <w:rPr>

</xml_diff>